<commit_message>
Update PA Dan 1 ready for reporting, embed pages, and docx report
</commit_message>
<xml_diff>
--- a/website/รายงานผลการพัฒนางาน PA 2569 นายอนันตชัย เพ็ชรรี่.docx
+++ b/website/รายงานผลการพัฒนางาน PA 2569 นายอนันตชัย เพ็ชรรี่.docx
@@ -93,10 +93,11 @@
       <w:pPr>
         <w:jc w:val="center"/>
       </w:pPr>
+      <w:r/>
       <w:r>
         <w:drawing>
           <wp:inline xmlns:a="http://schemas.openxmlformats.org/drawingml/2006/main" xmlns:pic="http://schemas.openxmlformats.org/drawingml/2006/picture">
-            <wp:extent cx="1645920" cy="2106778"/>
+            <wp:extent cx="1645920" cy="2193786"/>
             <wp:docPr id="1" name="Picture 1" descr="ภาพครูอนันตชัย เพ็ชรรี่"/>
             <wp:cNvGraphicFramePr>
               <a:graphicFrameLocks noChangeAspect="1"/>
@@ -105,7 +106,7 @@
               <a:graphicData uri="http://schemas.openxmlformats.org/drawingml/2006/picture">
                 <pic:pic>
                   <pic:nvPicPr>
-                    <pic:cNvPr id="0" name="01_รูปโปรไฟล์ครูเจมส์_เสื้อสูทแดง.jpg"/>
+                    <pic:cNvPr id="0" name="image.jpg"/>
                     <pic:cNvPicPr/>
                   </pic:nvPicPr>
                   <pic:blipFill>
@@ -117,7 +118,7 @@
                   <pic:spPr>
                     <a:xfrm>
                       <a:off x="0" y="0"/>
-                      <a:ext cx="1645920" cy="2106778"/>
+                      <a:ext cx="1645920" cy="2193786"/>
                     </a:xfrm>
                     <a:prstGeom prst="rect"/>
                   </pic:spPr>

</xml_diff>